<commit_message>
Added on 17th Mar 2026 -2
</commit_message>
<xml_diff>
--- a/Raja_Dinakaran_CV_NET.docx
+++ b/Raja_Dinakaran_CV_NET.docx
@@ -209,16 +209,7 @@
           <w:sz w:val="20"/>
           <w:szCs w:val="20"/>
         </w:rPr>
-        <w:t>Senior Software Development Engineer</w:t>
-      </w:r>
-      <w:r>
-        <w:rPr>
-          <w:rFonts w:eastAsia="Aptos" w:cs="Calibri" w:ascii="Aptos" w:hAnsi="Aptos"/>
-          <w:color w:val="404040"/>
-          <w:sz w:val="20"/>
-          <w:szCs w:val="20"/>
-        </w:rPr>
-        <w:t xml:space="preserve"> with 15+ years of experience in developing and implementing .NET web-based applications, Windows and console applications using C#, .NET Framework, .NET Core, WPF and Entity Framework.</w:t>
+        <w:t>Senior Software Development Engineer with 15+ years of experience in developing and implementing .NET web-based applications, Windows and console applications using C#, .NET Framework, .NET Core, WPF and Entity Framework.</w:t>
       </w:r>
     </w:p>
     <w:p>
@@ -297,27 +288,7 @@
           <w:sz w:val="20"/>
           <w:szCs w:val="20"/>
         </w:rPr>
-        <w:t xml:space="preserve">Proficient in web technologies including ASP.NET MVC, JavaScript, jQuery, HTML5, XML, CSS3, </w:t>
-      </w:r>
-      <w:r>
-        <w:rPr>
-          <w:rFonts w:cs="Calibri" w:ascii="Aptos" w:hAnsi="Aptos"/>
-          <w:b w:val="false"/>
-          <w:bCs w:val="false"/>
-          <w:sz w:val="20"/>
-          <w:szCs w:val="20"/>
-        </w:rPr>
-        <w:t>React.js,</w:t>
-      </w:r>
-      <w:r>
-        <w:rPr>
-          <w:rFonts w:cs="Calibri" w:ascii="Aptos" w:hAnsi="Aptos"/>
-          <w:b w:val="false"/>
-          <w:bCs w:val="false"/>
-          <w:sz w:val="20"/>
-          <w:szCs w:val="20"/>
-        </w:rPr>
-        <w:t xml:space="preserve"> Node.js, and WCF</w:t>
+        <w:t>Proficient in web technologies including ASP.NET MVC, JavaScript, jQuery, HTML5, XML, CSS3, React.js, Node.js, and WCF</w:t>
       </w:r>
     </w:p>
     <w:p>
@@ -346,7 +317,7 @@
           <w:sz w:val="20"/>
           <w:szCs w:val="20"/>
         </w:rPr>
-        <w:t>Hands-on experience in Generative AI (GenAI), building intelligent applications leveraging Azure OpenAI, LLMs (Large Language Models), and Retrieval-Augmented Generation (RAG) frameworks</w:t>
+        <w:t>Hands-on experience in Generative AI (GenAI), building intelligent applications leveraging Azure OpenAI, LLMs (Large Language Models)</w:t>
       </w:r>
     </w:p>
     <w:p>
@@ -377,47 +348,7 @@
           <w:sz w:val="20"/>
           <w:szCs w:val="20"/>
         </w:rPr>
-        <w:t xml:space="preserve">Strong experience with RDBMs database design including constraints, joins, views, procedures, and triggers in </w:t>
-      </w:r>
-      <w:r>
-        <w:rPr>
-          <w:rFonts w:cs="Calibri" w:ascii="Aptos" w:hAnsi="Aptos"/>
-          <w:b w:val="false"/>
-          <w:bCs w:val="false"/>
-          <w:sz w:val="20"/>
-          <w:szCs w:val="20"/>
-        </w:rPr>
-        <w:t>MS-</w:t>
-      </w:r>
-      <w:r>
-        <w:rPr>
-          <w:rFonts w:cs="Calibri" w:ascii="Aptos" w:hAnsi="Aptos"/>
-          <w:b w:val="false"/>
-          <w:bCs w:val="false"/>
-          <w:sz w:val="20"/>
-          <w:szCs w:val="20"/>
-        </w:rPr>
-        <w:t xml:space="preserve">SQL </w:t>
-      </w:r>
-      <w:r>
-        <w:rPr>
-          <w:rFonts w:cs="Calibri" w:ascii="Aptos" w:hAnsi="Aptos"/>
-          <w:b w:val="false"/>
-          <w:bCs w:val="false"/>
-          <w:sz w:val="20"/>
-          <w:szCs w:val="20"/>
-        </w:rPr>
-        <w:t>and Oracle</w:t>
-      </w:r>
-      <w:r>
-        <w:rPr>
-          <w:rFonts w:cs="Calibri" w:ascii="Aptos" w:hAnsi="Aptos"/>
-          <w:b w:val="false"/>
-          <w:bCs w:val="false"/>
-          <w:sz w:val="20"/>
-          <w:szCs w:val="20"/>
-        </w:rPr>
-        <w:t xml:space="preserve"> Server</w:t>
+        <w:t>Strong experience with RDBMs database design including constraints, joins, views, procedures, and triggers in MS-SQL and Oracle Server</w:t>
       </w:r>
     </w:p>
     <w:p>
@@ -446,7 +377,31 @@
           <w:sz w:val="20"/>
           <w:szCs w:val="20"/>
         </w:rPr>
-        <w:t>Proficient in version control tools (GitHub, TFS, SVN, Clear Case), testing frameworks (MS-Unit, NUnit, X-Unit), and cloud technologies (Azure, AWS)</w:t>
+        <w:t xml:space="preserve">Proficient in version control tools (GitHub, </w:t>
+      </w:r>
+      <w:r>
+        <w:rPr>
+          <w:rFonts w:eastAsia="Calibri" w:cs="Aptos" w:ascii="aptos" w:hAnsi="aptos" w:cstheme="minorHAnsi"/>
+          <w:b w:val="false"/>
+          <w:bCs/>
+          <w:color w:val="404040"/>
+          <w:kern w:val="0"/>
+          <w:sz w:val="20"/>
+          <w:szCs w:val="20"/>
+          <w:lang w:val="en-US" w:eastAsia="en-US" w:bidi="ar-SA"/>
+        </w:rPr>
+        <w:t>Rational Team Concert, VSS</w:t>
+      </w:r>
+      <w:r>
+        <w:rPr>
+          <w:rFonts w:eastAsia="Aptos" w:cs="Calibri" w:ascii="Aptos" w:hAnsi="Aptos"/>
+          <w:b w:val="false"/>
+          <w:bCs w:val="false"/>
+          <w:color w:val="404040"/>
+          <w:sz w:val="20"/>
+          <w:szCs w:val="20"/>
+        </w:rPr>
+        <w:t>)</w:t>
       </w:r>
     </w:p>
     <w:p>
@@ -1341,7 +1296,23 @@
       </w:pPr>
       <w:r>
         <w:rPr/>
-        <w:t xml:space="preserve">Senior Developer | Tata Consultancy Services | Cigna | Postage Feature </w:t>
+        <w:t>Senior Developer | Tata Consultancy Services | Cigna | Postage Feature</w:t>
+      </w:r>
+    </w:p>
+    <w:p>
+      <w:pPr>
+        <w:pStyle w:val="Heading2"/>
+        <w:spacing w:before="0" w:after="85"/>
+        <w:ind w:left="-5" w:hanging="10"/>
+        <w:rPr/>
+      </w:pPr>
+      <w:r>
+        <w:rPr/>
+        <w:t>Key Responsibilities:-</w:t>
+      </w:r>
+      <w:r>
+        <w:rPr/>
+        <w:t xml:space="preserve"> </w:t>
       </w:r>
     </w:p>
     <w:p>
@@ -1360,7 +1331,93 @@
           <w:rFonts w:eastAsia="Aptos" w:cs="Aptos" w:ascii="Aptos" w:hAnsi="Aptos"/>
           <w:sz w:val="24"/>
         </w:rPr>
-        <w:t>Worked on Oracle Forms and Oracle PL/SQL to develop, enhance, and maintain data-driven enterprise applications.</w:t>
+        <w:t xml:space="preserve">Led development and optimization of mission-critical applications using Oracle Forms </w:t>
+      </w:r>
+      <w:r>
+        <w:rPr>
+          <w:rFonts w:eastAsia="Aptos" w:cs="Aptos" w:ascii="Aptos" w:hAnsi="Aptos"/>
+          <w:sz w:val="24"/>
+        </w:rPr>
+        <w:t>(</w:t>
+      </w:r>
+      <w:r>
+        <w:rPr>
+          <w:rStyle w:val="StrongEmphasis"/>
+          <w:rFonts w:eastAsia="Aptos" w:cs="Aptos" w:ascii="Google Sans;Arial;sans-serif" w:hAnsi="Google Sans;Arial;sans-serif"/>
+          <w:b w:val="false"/>
+          <w:i w:val="false"/>
+          <w:caps w:val="false"/>
+          <w:smallCaps w:val="false"/>
+          <w:color w:val="0A0A0A"/>
+          <w:spacing w:val="0"/>
+          <w:sz w:val="24"/>
+        </w:rPr>
+        <w:t>12.2.1.19</w:t>
+      </w:r>
+      <w:r>
+        <w:rPr>
+          <w:rStyle w:val="StrongEmphasis"/>
+          <w:rFonts w:eastAsia="Aptos" w:cs="Aptos" w:ascii="Aptos" w:hAnsi="Aptos"/>
+          <w:b w:val="false"/>
+          <w:i w:val="false"/>
+          <w:caps w:val="false"/>
+          <w:smallCaps w:val="false"/>
+          <w:color w:val="0A0A0A"/>
+          <w:spacing w:val="0"/>
+          <w:sz w:val="24"/>
+        </w:rPr>
+        <w:t>)</w:t>
+      </w:r>
+      <w:r>
+        <w:rPr>
+          <w:rFonts w:eastAsia="Aptos" w:cs="Aptos" w:ascii="Aptos" w:hAnsi="Aptos"/>
+          <w:sz w:val="24"/>
+        </w:rPr>
+        <w:t xml:space="preserve">and Oracle PL/SQL </w:t>
+      </w:r>
+      <w:r>
+        <w:rPr>
+          <w:rFonts w:eastAsia="Aptos" w:cs="Aptos" w:ascii="Aptos" w:hAnsi="Aptos"/>
+          <w:sz w:val="24"/>
+        </w:rPr>
+        <w:t>(19c)</w:t>
+      </w:r>
+      <w:r>
+        <w:rPr>
+          <w:rFonts w:eastAsia="Aptos" w:cs="Aptos" w:ascii="Aptos" w:hAnsi="Aptos"/>
+          <w:sz w:val="24"/>
+        </w:rPr>
+        <w:t>.</w:t>
+      </w:r>
+    </w:p>
+    <w:p>
+      <w:pPr>
+        <w:pStyle w:val="Normal"/>
+        <w:widowControl/>
+        <w:numPr>
+          <w:ilvl w:val="0"/>
+          <w:numId w:val="2"/>
+        </w:numPr>
+        <w:suppressAutoHyphens w:val="true"/>
+        <w:bidi w:val="0"/>
+        <w:spacing w:lineRule="auto" w:line="252" w:before="0" w:after="0"/>
+        <w:ind w:left="269" w:right="0" w:hanging="0"/>
+        <w:jc w:val="left"/>
+        <w:rPr>
+          <w:rFonts w:ascii="aptos" w:hAnsi="aptos"/>
+          <w:sz w:val="24"/>
+          <w:szCs w:val="24"/>
+        </w:rPr>
+      </w:pPr>
+      <w:r>
+        <w:rPr>
+          <w:rFonts w:ascii="aptos" w:hAnsi="aptos"/>
+          <w:sz w:val="24"/>
+          <w:szCs w:val="24"/>
+        </w:rPr>
+        <w:t xml:space="preserve">Defined enterprise architecture standards, coding guidelines, and design </w:t>
+        <w:tab/>
+        <w:t>patterns across frontend and backend teams.</w:t>
       </w:r>
     </w:p>
     <w:p>
@@ -1609,6 +1666,22 @@
     </w:p>
     <w:p>
       <w:pPr>
+        <w:pStyle w:val="Heading2"/>
+        <w:spacing w:before="0" w:after="85"/>
+        <w:ind w:left="-5" w:hanging="10"/>
+        <w:rPr/>
+      </w:pPr>
+      <w:r>
+        <w:rPr/>
+        <w:t>Key Responsibilities:-</w:t>
+      </w:r>
+      <w:r>
+        <w:rPr/>
+        <w:t xml:space="preserve"> </w:t>
+      </w:r>
+    </w:p>
+    <w:p>
+      <w:pPr>
         <w:pStyle w:val="Normal"/>
         <w:numPr>
           <w:ilvl w:val="0"/>
@@ -1828,6 +1901,22 @@
     </w:p>
     <w:p>
       <w:pPr>
+        <w:pStyle w:val="Heading2"/>
+        <w:spacing w:before="0" w:after="85"/>
+        <w:ind w:left="-5" w:hanging="10"/>
+        <w:rPr/>
+      </w:pPr>
+      <w:r>
+        <w:rPr/>
+        <w:t>Key Responsibilities:-</w:t>
+      </w:r>
+      <w:r>
+        <w:rPr/>
+        <w:t xml:space="preserve"> </w:t>
+      </w:r>
+    </w:p>
+    <w:p>
+      <w:pPr>
         <w:pStyle w:val="Normal"/>
         <w:numPr>
           <w:ilvl w:val="0"/>
@@ -1847,7 +1936,23 @@
           <w:sz w:val="24"/>
           <w:szCs w:val="24"/>
         </w:rPr>
-        <w:t xml:space="preserve">Analysis, Design and Implementation of Applications using Oracle RDBMS. </w:t>
+        <w:t xml:space="preserve">Analysis, Design and Implementation of Applications using Oracle RDBMS </w:t>
+      </w:r>
+      <w:r>
+        <w:rPr>
+          <w:rFonts w:eastAsia="Aptos" w:cs="Aptos" w:ascii="aptos" w:hAnsi="aptos"/>
+          <w:sz w:val="24"/>
+          <w:szCs w:val="24"/>
+        </w:rPr>
+        <w:t>(Oracle PL/SQL 19c)</w:t>
+      </w:r>
+      <w:r>
+        <w:rPr>
+          <w:rFonts w:eastAsia="Aptos" w:cs="Aptos" w:ascii="aptos" w:hAnsi="aptos"/>
+          <w:sz w:val="24"/>
+          <w:szCs w:val="24"/>
+        </w:rPr>
+        <w:t xml:space="preserve">. </w:t>
       </w:r>
     </w:p>
     <w:p>
@@ -2217,7 +2322,23 @@
           <w:sz w:val="24"/>
           <w:szCs w:val="24"/>
         </w:rPr>
-        <w:t xml:space="preserve">Involved in all phases of the SDLC (Software Development Life Cycle) </w:t>
+        <w:t>Developed Web forms that have been used extensively in ASP.NET for F</w:t>
+      </w:r>
+      <w:r>
+        <w:rPr>
+          <w:rFonts w:eastAsia="Arial" w:cs="Arial" w:ascii="aptos" w:hAnsi="aptos"/>
+          <w:sz w:val="24"/>
+          <w:szCs w:val="24"/>
+        </w:rPr>
+        <w:t>rontend.</w:t>
+      </w:r>
+      <w:r>
+        <w:rPr>
+          <w:rFonts w:eastAsia="Arial" w:cs="Arial" w:ascii="aptos" w:hAnsi="aptos"/>
+          <w:sz w:val="24"/>
+          <w:szCs w:val="24"/>
+        </w:rPr>
+        <w:t xml:space="preserve">  </w:t>
       </w:r>
     </w:p>
     <w:p>
@@ -2241,7 +2362,7 @@
           <w:sz w:val="24"/>
           <w:szCs w:val="24"/>
         </w:rPr>
-        <w:t xml:space="preserve">Requirements gathering and translating it into design document. </w:t>
+        <w:t xml:space="preserve">Expertise in creating visually appealing user interface with CSS </w:t>
       </w:r>
     </w:p>
     <w:p>
@@ -2265,7 +2386,7 @@
           <w:sz w:val="24"/>
           <w:szCs w:val="24"/>
         </w:rPr>
-        <w:t xml:space="preserve">Development, testing and implementation of code ensuring timely delivery against aggressive deadlines. </w:t>
+        <w:t xml:space="preserve">Effectively made use of Table Functions, Indexes, Collections, Materialized Views and Query Re-Write. </w:t>
       </w:r>
     </w:p>
     <w:p>
@@ -2313,7 +2434,7 @@
           <w:sz w:val="24"/>
           <w:szCs w:val="24"/>
         </w:rPr>
-        <w:t xml:space="preserve">Effectively made use of Table Functions, Indexes, Collections, Materialized Views and Query Re-Write. </w:t>
+        <w:t xml:space="preserve">Involved in all phases of the SDLC (Software Development Life Cycle) </w:t>
       </w:r>
     </w:p>
     <w:p>
@@ -2337,7 +2458,7 @@
           <w:sz w:val="24"/>
           <w:szCs w:val="24"/>
         </w:rPr>
-        <w:t xml:space="preserve">Developed Web forms that have been used extensively in ASP.NET for FE  </w:t>
+        <w:t xml:space="preserve">Requirements gathering and translating it into design document. </w:t>
       </w:r>
     </w:p>
     <w:p>
@@ -2361,7 +2482,7 @@
           <w:sz w:val="24"/>
           <w:szCs w:val="24"/>
         </w:rPr>
-        <w:t xml:space="preserve">Expertise in creating visually appealing user interface with CSS </w:t>
+        <w:t xml:space="preserve">Development, testing and implementation of code ensuring timely delivery against aggressive deadlines. </w:t>
       </w:r>
     </w:p>
     <w:p>
@@ -2446,6 +2567,25 @@
     <w:p>
       <w:pPr>
         <w:pStyle w:val="Normal"/>
+        <w:ind w:left="-5" w:hanging="10"/>
+        <w:rPr/>
+      </w:pPr>
+      <w:r>
+        <w:rPr>
+          <w:rFonts w:eastAsia="Aptos" w:cs="Aptos" w:ascii="Aptos" w:hAnsi="Aptos"/>
+          <w:b/>
+          <w:color w:val="000000"/>
+          <w:kern w:val="2"/>
+          <w:sz w:val="24"/>
+          <w:szCs w:val="24"/>
+          <w:lang w:val="en-US" w:eastAsia="en-US" w:bidi="ar-SA"/>
+        </w:rPr>
+        <w:t>Key Responsibilities:-</w:t>
+      </w:r>
+    </w:p>
+    <w:p>
+      <w:pPr>
+        <w:pStyle w:val="Normal"/>
         <w:numPr>
           <w:ilvl w:val="0"/>
           <w:numId w:val="6"/>
@@ -2456,18 +2596,22 @@
       </w:pPr>
       <w:r>
         <w:rPr>
-          <w:rFonts w:eastAsia="Aptos" w:cs="Aptos" w:ascii="Aptos" w:hAnsi="Aptos"/>
-          <w:sz w:val="24"/>
-        </w:rPr>
-        <w:t>Requirements gathering and translating it into design document.</w:t>
-      </w:r>
-      <w:r>
-        <w:rPr>
-          <w:rFonts w:eastAsia="Aptos" w:cs="Aptos" w:ascii="Aptos" w:hAnsi="Aptos"/>
-          <w:color w:val="404040"/>
-          <w:sz w:val="20"/>
-        </w:rPr>
-        <w:t xml:space="preserve"> </w:t>
+          <w:rStyle w:val="StrongEmphasis"/>
+          <w:rFonts w:eastAsia="Aptos" w:cs="Aptos" w:ascii="Aptos" w:hAnsi="Aptos"/>
+          <w:b w:val="false"/>
+          <w:bCs w:val="false"/>
+          <w:sz w:val="24"/>
+        </w:rPr>
+        <w:t>Created and enhanced ASP.NET applications with MS-SQL backend architecture</w:t>
+      </w:r>
+      <w:r>
+        <w:rPr>
+          <w:rFonts w:eastAsia="Aptos" w:cs="Aptos" w:ascii="Aptos" w:hAnsi="Aptos"/>
+          <w:b w:val="false"/>
+          <w:bCs w:val="false"/>
+          <w:sz w:val="24"/>
+        </w:rPr>
+        <w:t>, ensuring reliable performance through query optimization, secure integrations, and systematic data handling.</w:t>
       </w:r>
     </w:p>
     <w:p>
@@ -2479,14 +2623,22 @@
         </w:numPr>
         <w:spacing w:lineRule="auto" w:line="252" w:before="0" w:after="3"/>
         <w:ind w:left="1081" w:hanging="360"/>
-        <w:rPr/>
-      </w:pPr>
-      <w:r>
-        <w:rPr>
-          <w:rFonts w:eastAsia="Aptos" w:cs="Aptos" w:ascii="Aptos" w:hAnsi="Aptos"/>
-          <w:sz w:val="24"/>
-        </w:rPr>
-        <w:t xml:space="preserve">Code design, unit testing and Implementation. </w:t>
+        <w:rPr>
+          <w:rFonts w:ascii="Aptos" w:hAnsi="Aptos" w:eastAsia="Aptos" w:cs="Aptos"/>
+          <w:b w:val="false"/>
+          <w:b w:val="false"/>
+          <w:bCs w:val="false"/>
+          <w:sz w:val="24"/>
+        </w:rPr>
+      </w:pPr>
+      <w:r>
+        <w:rPr>
+          <w:rFonts w:eastAsia="Aptos" w:cs="Aptos" w:ascii="Aptos" w:hAnsi="Aptos"/>
+          <w:b w:val="false"/>
+          <w:bCs w:val="false"/>
+          <w:sz w:val="24"/>
+        </w:rPr>
+        <w:t>Additionally, Implemented a robust scheduler using .NET with an MS-SQL backend to automate tasks and ensure reliable, time-based process execution.</w:t>
       </w:r>
     </w:p>
     <w:p>
@@ -2502,22 +2654,18 @@
       </w:pPr>
       <w:r>
         <w:rPr>
-          <w:rStyle w:val="StrongEmphasis"/>
-          <w:rFonts w:eastAsia="Aptos" w:cs="Aptos" w:ascii="Aptos" w:hAnsi="Aptos"/>
-          <w:b w:val="false"/>
-          <w:bCs w:val="false"/>
-          <w:sz w:val="24"/>
-        </w:rPr>
-        <w:t>Created and enhanced ASP.NET applications with MS-SQL backend architecture</w:t>
-      </w:r>
-      <w:r>
-        <w:rPr>
-          <w:rFonts w:eastAsia="Aptos" w:cs="Aptos" w:ascii="Aptos" w:hAnsi="Aptos"/>
-          <w:b w:val="false"/>
-          <w:bCs w:val="false"/>
-          <w:sz w:val="24"/>
-        </w:rPr>
-        <w:t>, ensuring reliable performance through query optimization, secure integrations, and systematic data handling.</w:t>
+          <w:rFonts w:eastAsia="Aptos" w:cs="Aptos" w:ascii="Aptos" w:hAnsi="Aptos"/>
+          <w:sz w:val="24"/>
+        </w:rPr>
+        <w:t>Requirements gathering and translating it into design document.</w:t>
+      </w:r>
+      <w:r>
+        <w:rPr>
+          <w:rFonts w:eastAsia="Aptos" w:cs="Aptos" w:ascii="Aptos" w:hAnsi="Aptos"/>
+          <w:color w:val="404040"/>
+          <w:sz w:val="20"/>
+        </w:rPr>
+        <w:t xml:space="preserve"> </w:t>
       </w:r>
     </w:p>
     <w:p>
@@ -2529,22 +2677,14 @@
         </w:numPr>
         <w:spacing w:lineRule="auto" w:line="252" w:before="0" w:after="3"/>
         <w:ind w:left="1081" w:hanging="360"/>
-        <w:rPr>
-          <w:rFonts w:ascii="Aptos" w:hAnsi="Aptos" w:eastAsia="Aptos" w:cs="Aptos"/>
-          <w:b w:val="false"/>
-          <w:b w:val="false"/>
-          <w:bCs w:val="false"/>
-          <w:sz w:val="24"/>
-        </w:rPr>
-      </w:pPr>
-      <w:r>
-        <w:rPr>
-          <w:rFonts w:eastAsia="Aptos" w:cs="Aptos" w:ascii="Aptos" w:hAnsi="Aptos"/>
-          <w:b w:val="false"/>
-          <w:bCs w:val="false"/>
-          <w:sz w:val="24"/>
-        </w:rPr>
-        <w:t>Additionally, Implemented a robust scheduler using .NET with an MS-SQL backend to automate tasks and ensure reliable, time-based process execution.</w:t>
+        <w:rPr/>
+      </w:pPr>
+      <w:r>
+        <w:rPr>
+          <w:rFonts w:eastAsia="Aptos" w:cs="Aptos" w:ascii="Aptos" w:hAnsi="Aptos"/>
+          <w:sz w:val="24"/>
+        </w:rPr>
+        <w:t>Code design, unit testing and Implementation.</w:t>
       </w:r>
     </w:p>
     <w:p>
@@ -2631,28 +2771,59 @@
     <w:p>
       <w:pPr>
         <w:pStyle w:val="Normal"/>
+        <w:ind w:left="-5" w:hanging="10"/>
+        <w:rPr/>
+      </w:pPr>
+      <w:r>
+        <w:rPr>
+          <w:rFonts w:eastAsia="Aptos" w:cs="Aptos" w:ascii="Aptos" w:hAnsi="Aptos"/>
+          <w:b/>
+          <w:color w:val="000000"/>
+          <w:kern w:val="2"/>
+          <w:sz w:val="24"/>
+          <w:szCs w:val="24"/>
+          <w:lang w:val="en-US" w:eastAsia="en-US" w:bidi="ar-SA"/>
+        </w:rPr>
+        <w:t>Key Responsibilities:-</w:t>
+      </w:r>
+    </w:p>
+    <w:p>
+      <w:pPr>
+        <w:pStyle w:val="Normal"/>
         <w:numPr>
           <w:ilvl w:val="0"/>
           <w:numId w:val="7"/>
         </w:numPr>
         <w:spacing w:lineRule="auto" w:line="252" w:before="0" w:after="3"/>
         <w:ind w:left="706" w:hanging="360"/>
-        <w:rPr/>
-      </w:pPr>
-      <w:r>
-        <w:rPr>
-          <w:rFonts w:eastAsia="Aptos" w:cs="Aptos" w:ascii="Aptos" w:hAnsi="Aptos"/>
-          <w:sz w:val="24"/>
-        </w:rPr>
-        <w:t>Requirements gathering and translating it into design document.</w:t>
-      </w:r>
-      <w:r>
-        <w:rPr>
-          <w:rFonts w:eastAsia="Aptos" w:cs="Aptos" w:ascii="Aptos" w:hAnsi="Aptos"/>
+        <w:rPr>
+          <w:rFonts w:ascii="Aptos" w:hAnsi="Aptos" w:eastAsia="Aptos" w:cs="Aptos"/>
           <w:color w:val="404040"/>
           <w:sz w:val="20"/>
         </w:rPr>
-        <w:t xml:space="preserve"> </w:t>
+      </w:pPr>
+      <w:r>
+        <w:rPr>
+          <w:rStyle w:val="StrongEmphasis"/>
+          <w:rFonts w:eastAsia="Aptos" w:cs="Aptos" w:ascii="Aptos" w:hAnsi="Aptos"/>
+          <w:b w:val="false"/>
+          <w:bCs w:val="false"/>
+          <w:color w:val="404040"/>
+          <w:sz w:val="24"/>
+          <w:szCs w:val="24"/>
+        </w:rPr>
+        <w:t>Engineered ASP.NET web solutions integrated with well-structured MS-SQL databases</w:t>
+      </w:r>
+      <w:r>
+        <w:rPr>
+          <w:rFonts w:eastAsia="Aptos" w:cs="Aptos" w:ascii="Aptos" w:hAnsi="Aptos"/>
+          <w:b w:val="false"/>
+          <w:bCs w:val="false"/>
+          <w:color w:val="404040"/>
+          <w:sz w:val="24"/>
+          <w:szCs w:val="24"/>
+        </w:rPr>
+        <w:t>, using efficient stored procedures, triggers, and backend logic to enhance data flow and application speed.</w:t>
       </w:r>
     </w:p>
     <w:p>
@@ -2671,7 +2842,7 @@
           <w:rFonts w:eastAsia="Aptos" w:cs="Aptos" w:ascii="Aptos" w:hAnsi="Aptos"/>
           <w:sz w:val="24"/>
         </w:rPr>
-        <w:t>Code design, unit testing and Implementation.</w:t>
+        <w:t>Requirements gathering and translating it into design document.</w:t>
       </w:r>
       <w:r>
         <w:rPr>
@@ -2691,34 +2862,22 @@
         </w:numPr>
         <w:spacing w:lineRule="auto" w:line="252" w:before="0" w:after="3"/>
         <w:ind w:left="706" w:hanging="360"/>
-        <w:rPr>
-          <w:rFonts w:ascii="Aptos" w:hAnsi="Aptos" w:eastAsia="Aptos" w:cs="Aptos"/>
+        <w:rPr/>
+      </w:pPr>
+      <w:r>
+        <w:rPr>
+          <w:rFonts w:eastAsia="Aptos" w:cs="Aptos" w:ascii="Aptos" w:hAnsi="Aptos"/>
+          <w:sz w:val="24"/>
+        </w:rPr>
+        <w:t>Code design, unit testing and Implementation.</w:t>
+      </w:r>
+      <w:r>
+        <w:rPr>
+          <w:rFonts w:eastAsia="Aptos" w:cs="Aptos" w:ascii="Aptos" w:hAnsi="Aptos"/>
           <w:color w:val="404040"/>
           <w:sz w:val="20"/>
         </w:rPr>
-      </w:pPr>
-      <w:r>
-        <w:rPr>
-          <w:rStyle w:val="StrongEmphasis"/>
-          <w:rFonts w:eastAsia="Aptos" w:cs="Aptos" w:ascii="Aptos" w:hAnsi="Aptos"/>
-          <w:b w:val="false"/>
-          <w:bCs w:val="false"/>
-          <w:color w:val="404040"/>
-          <w:sz w:val="24"/>
-          <w:szCs w:val="24"/>
-        </w:rPr>
-        <w:t>Engineered ASP.NET web solutions integrated with well-structured MS-SQL databases</w:t>
-      </w:r>
-      <w:r>
-        <w:rPr>
-          <w:rFonts w:eastAsia="Aptos" w:cs="Aptos" w:ascii="Aptos" w:hAnsi="Aptos"/>
-          <w:b w:val="false"/>
-          <w:bCs w:val="false"/>
-          <w:color w:val="404040"/>
-          <w:sz w:val="24"/>
-          <w:szCs w:val="24"/>
-        </w:rPr>
-        <w:t>, using efficient stored procedures, triggers, and backend logic to enhance data flow and application speed.</w:t>
+        <w:t xml:space="preserve"> </w:t>
       </w:r>
     </w:p>
     <w:p>
@@ -2855,6 +3014,25 @@
     <w:p>
       <w:pPr>
         <w:pStyle w:val="Normal"/>
+        <w:ind w:left="-5" w:hanging="10"/>
+        <w:rPr/>
+      </w:pPr>
+      <w:r>
+        <w:rPr>
+          <w:rFonts w:eastAsia="Aptos" w:cs="Aptos" w:ascii="Aptos" w:hAnsi="Aptos"/>
+          <w:b/>
+          <w:color w:val="000000"/>
+          <w:kern w:val="2"/>
+          <w:sz w:val="24"/>
+          <w:szCs w:val="24"/>
+          <w:lang w:val="en-US" w:eastAsia="en-US" w:bidi="ar-SA"/>
+        </w:rPr>
+        <w:t>Key Responsibilities:-</w:t>
+      </w:r>
+    </w:p>
+    <w:p>
+      <w:pPr>
+        <w:pStyle w:val="Normal"/>
         <w:numPr>
           <w:ilvl w:val="0"/>
           <w:numId w:val="8"/>
@@ -3015,6 +3193,30 @@
           <w:sz w:val="24"/>
         </w:rPr>
         <w:t xml:space="preserve">Developer| FUTURE TEC TECHNOLOGIES PVT LTD | Chennai </w:t>
+      </w:r>
+    </w:p>
+    <w:p>
+      <w:pPr>
+        <w:pStyle w:val="Normal"/>
+        <w:widowControl/>
+        <w:suppressAutoHyphens w:val="true"/>
+        <w:bidi w:val="0"/>
+        <w:spacing w:lineRule="auto" w:line="252" w:before="0" w:after="3"/>
+        <w:ind w:left="-5" w:hanging="10"/>
+        <w:jc w:val="left"/>
+        <w:rPr/>
+      </w:pPr>
+      <w:r>
+        <w:rPr>
+          <w:rFonts w:eastAsia="Aptos" w:cs="Aptos" w:ascii="Aptos" w:hAnsi="Aptos"/>
+          <w:b/>
+          <w:color w:val="000000"/>
+          <w:kern w:val="2"/>
+          <w:sz w:val="24"/>
+          <w:szCs w:val="24"/>
+          <w:lang w:val="en-US" w:eastAsia="en-US" w:bidi="ar-SA"/>
+        </w:rPr>
+        <w:t>Key Responsibilities:-</w:t>
       </w:r>
     </w:p>
     <w:p>

</xml_diff>